<commit_message>
ajustes finais e docimentação de implementação
</commit_message>
<xml_diff>
--- a/Docs/Fluxo de Caixa.docx
+++ b/Docs/Fluxo de Caixa.docx
@@ -4,7 +4,7 @@
   <w:body>
     <w:p>
       <w:pPr>
-        <w:jc w:val="center"/>
+        <w:jc w:val="both"/>
         <w:rPr>
           <w:color w:val="4472C4" w:themeColor="accent1"/>
           <w:sz w:val="48"/>
@@ -79,8 +79,9 @@
     <w:p>
       <w:pPr>
         <w:pStyle w:val="Ttulo1"/>
-      </w:pPr>
-      <w:bookmarkStart w:id="0" w:name="_Toc135130841"/>
+        <w:jc w:val="both"/>
+      </w:pPr>
+      <w:bookmarkStart w:id="0" w:name="_Toc135132015"/>
       <w:r>
         <w:t>Indice</w:t>
       </w:r>
@@ -111,6 +112,7 @@
         <w:p>
           <w:pPr>
             <w:pStyle w:val="CabealhodoSumrio"/>
+            <w:jc w:val="both"/>
           </w:pPr>
           <w:r>
             <w:t>Sumário</w:t>
@@ -137,7 +139,7 @@
           <w:r>
             <w:fldChar w:fldCharType="separate"/>
           </w:r>
-          <w:hyperlink w:anchor="_Toc135130841" w:history="1">
+          <w:hyperlink w:anchor="_Toc135132015" w:history="1">
             <w:r>
               <w:rPr>
                 <w:rStyle w:val="Hyperlink"/>
@@ -164,7 +166,7 @@
                 <w:noProof/>
                 <w:webHidden/>
               </w:rPr>
-              <w:instrText xml:space="preserve"> PAGEREF _Toc135130841 \h </w:instrText>
+              <w:instrText xml:space="preserve"> PAGEREF _Toc135132015 \h </w:instrText>
             </w:r>
             <w:r>
               <w:rPr>
@@ -207,7 +209,7 @@
               <w:lang w:eastAsia="pt-BR"/>
             </w:rPr>
           </w:pPr>
-          <w:hyperlink w:anchor="_Toc135130842" w:history="1">
+          <w:hyperlink w:anchor="_Toc135132016" w:history="1">
             <w:r>
               <w:rPr>
                 <w:rStyle w:val="Hyperlink"/>
@@ -234,7 +236,7 @@
                 <w:noProof/>
                 <w:webHidden/>
               </w:rPr>
-              <w:instrText xml:space="preserve"> PAGEREF _Toc135130842 \h </w:instrText>
+              <w:instrText xml:space="preserve"> PAGEREF _Toc135132016 \h </w:instrText>
             </w:r>
             <w:r>
               <w:rPr>
@@ -277,13 +279,13 @@
               <w:lang w:eastAsia="pt-BR"/>
             </w:rPr>
           </w:pPr>
-          <w:hyperlink w:anchor="_Toc135130843" w:history="1">
+          <w:hyperlink w:anchor="_Toc135132017" w:history="1">
             <w:r>
               <w:rPr>
                 <w:rStyle w:val="Hyperlink"/>
                 <w:noProof/>
               </w:rPr>
-              <w:t>2 – Camadas</w:t>
+              <w:t>2 – Repositórios de Código</w:t>
             </w:r>
             <w:r>
               <w:rPr>
@@ -304,7 +306,7 @@
                 <w:noProof/>
                 <w:webHidden/>
               </w:rPr>
-              <w:instrText xml:space="preserve"> PAGEREF _Toc135130843 \h </w:instrText>
+              <w:instrText xml:space="preserve"> PAGEREF _Toc135132017 \h </w:instrText>
             </w:r>
             <w:r>
               <w:rPr>
@@ -347,13 +349,13 @@
               <w:lang w:eastAsia="pt-BR"/>
             </w:rPr>
           </w:pPr>
-          <w:hyperlink w:anchor="_Toc135130844" w:history="1">
+          <w:hyperlink w:anchor="_Toc135132018" w:history="1">
             <w:r>
               <w:rPr>
                 <w:rStyle w:val="Hyperlink"/>
                 <w:noProof/>
               </w:rPr>
-              <w:t>3 -Pacotes Externos</w:t>
+              <w:t>3 – O que foi implementado?</w:t>
             </w:r>
             <w:r>
               <w:rPr>
@@ -374,7 +376,7 @@
                 <w:noProof/>
                 <w:webHidden/>
               </w:rPr>
-              <w:instrText xml:space="preserve"> PAGEREF _Toc135130844 \h </w:instrText>
+              <w:instrText xml:space="preserve"> PAGEREF _Toc135132018 \h </w:instrText>
             </w:r>
             <w:r>
               <w:rPr>
@@ -417,13 +419,13 @@
               <w:lang w:eastAsia="pt-BR"/>
             </w:rPr>
           </w:pPr>
-          <w:hyperlink w:anchor="_Toc135130845" w:history="1">
+          <w:hyperlink w:anchor="_Toc135132019" w:history="1">
             <w:r>
               <w:rPr>
                 <w:rStyle w:val="Hyperlink"/>
                 <w:noProof/>
               </w:rPr>
-              <w:t>4 – Setup Banco</w:t>
+              <w:t>4 – Camadas</w:t>
             </w:r>
             <w:r>
               <w:rPr>
@@ -444,7 +446,7 @@
                 <w:noProof/>
                 <w:webHidden/>
               </w:rPr>
-              <w:instrText xml:space="preserve"> PAGEREF _Toc135130845 \h </w:instrText>
+              <w:instrText xml:space="preserve"> PAGEREF _Toc135132019 \h </w:instrText>
             </w:r>
             <w:r>
               <w:rPr>
@@ -487,13 +489,13 @@
               <w:lang w:eastAsia="pt-BR"/>
             </w:rPr>
           </w:pPr>
-          <w:hyperlink w:anchor="_Toc135130846" w:history="1">
+          <w:hyperlink w:anchor="_Toc135132020" w:history="1">
             <w:r>
               <w:rPr>
                 <w:rStyle w:val="Hyperlink"/>
                 <w:noProof/>
               </w:rPr>
-              <w:t>5 – Instalação</w:t>
+              <w:t>5 -Pacotes Externos</w:t>
             </w:r>
             <w:r>
               <w:rPr>
@@ -514,7 +516,7 @@
                 <w:noProof/>
                 <w:webHidden/>
               </w:rPr>
-              <w:instrText xml:space="preserve"> PAGEREF _Toc135130846 \h </w:instrText>
+              <w:instrText xml:space="preserve"> PAGEREF _Toc135132020 \h </w:instrText>
             </w:r>
             <w:r>
               <w:rPr>
@@ -534,7 +536,147 @@
                 <w:noProof/>
                 <w:webHidden/>
               </w:rPr>
-              <w:t>3</w:t>
+              <w:t>4</w:t>
+            </w:r>
+            <w:r>
+              <w:rPr>
+                <w:noProof/>
+                <w:webHidden/>
+              </w:rPr>
+              <w:fldChar w:fldCharType="end"/>
+            </w:r>
+          </w:hyperlink>
+        </w:p>
+        <w:p>
+          <w:pPr>
+            <w:pStyle w:val="Sumrio1"/>
+            <w:tabs>
+              <w:tab w:val="right" w:leader="dot" w:pos="8494"/>
+            </w:tabs>
+            <w:rPr>
+              <w:rFonts w:eastAsiaTheme="minorEastAsia"/>
+              <w:noProof/>
+              <w:lang w:eastAsia="pt-BR"/>
+            </w:rPr>
+          </w:pPr>
+          <w:hyperlink w:anchor="_Toc135132021" w:history="1">
+            <w:r>
+              <w:rPr>
+                <w:rStyle w:val="Hyperlink"/>
+                <w:noProof/>
+              </w:rPr>
+              <w:t>6 – Setup Banco</w:t>
+            </w:r>
+            <w:r>
+              <w:rPr>
+                <w:noProof/>
+                <w:webHidden/>
+              </w:rPr>
+              <w:tab/>
+            </w:r>
+            <w:r>
+              <w:rPr>
+                <w:noProof/>
+                <w:webHidden/>
+              </w:rPr>
+              <w:fldChar w:fldCharType="begin"/>
+            </w:r>
+            <w:r>
+              <w:rPr>
+                <w:noProof/>
+                <w:webHidden/>
+              </w:rPr>
+              <w:instrText xml:space="preserve"> PAGEREF _Toc135132021 \h </w:instrText>
+            </w:r>
+            <w:r>
+              <w:rPr>
+                <w:noProof/>
+                <w:webHidden/>
+              </w:rPr>
+            </w:r>
+            <w:r>
+              <w:rPr>
+                <w:noProof/>
+                <w:webHidden/>
+              </w:rPr>
+              <w:fldChar w:fldCharType="separate"/>
+            </w:r>
+            <w:r>
+              <w:rPr>
+                <w:noProof/>
+                <w:webHidden/>
+              </w:rPr>
+              <w:t>5</w:t>
+            </w:r>
+            <w:r>
+              <w:rPr>
+                <w:noProof/>
+                <w:webHidden/>
+              </w:rPr>
+              <w:fldChar w:fldCharType="end"/>
+            </w:r>
+          </w:hyperlink>
+        </w:p>
+        <w:p>
+          <w:pPr>
+            <w:pStyle w:val="Sumrio1"/>
+            <w:tabs>
+              <w:tab w:val="right" w:leader="dot" w:pos="8494"/>
+            </w:tabs>
+            <w:rPr>
+              <w:rFonts w:eastAsiaTheme="minorEastAsia"/>
+              <w:noProof/>
+              <w:lang w:eastAsia="pt-BR"/>
+            </w:rPr>
+          </w:pPr>
+          <w:hyperlink w:anchor="_Toc135132022" w:history="1">
+            <w:r>
+              <w:rPr>
+                <w:rStyle w:val="Hyperlink"/>
+                <w:noProof/>
+              </w:rPr>
+              <w:t>7 – Instalação</w:t>
+            </w:r>
+            <w:r>
+              <w:rPr>
+                <w:noProof/>
+                <w:webHidden/>
+              </w:rPr>
+              <w:tab/>
+            </w:r>
+            <w:r>
+              <w:rPr>
+                <w:noProof/>
+                <w:webHidden/>
+              </w:rPr>
+              <w:fldChar w:fldCharType="begin"/>
+            </w:r>
+            <w:r>
+              <w:rPr>
+                <w:noProof/>
+                <w:webHidden/>
+              </w:rPr>
+              <w:instrText xml:space="preserve"> PAGEREF _Toc135132022 \h </w:instrText>
+            </w:r>
+            <w:r>
+              <w:rPr>
+                <w:noProof/>
+                <w:webHidden/>
+              </w:rPr>
+            </w:r>
+            <w:r>
+              <w:rPr>
+                <w:noProof/>
+                <w:webHidden/>
+              </w:rPr>
+              <w:fldChar w:fldCharType="separate"/>
+            </w:r>
+            <w:r>
+              <w:rPr>
+                <w:noProof/>
+                <w:webHidden/>
+              </w:rPr>
+              <w:t>5</w:t>
             </w:r>
             <w:r>
               <w:rPr>
@@ -557,7 +699,7 @@
               <w:lang w:eastAsia="pt-BR"/>
             </w:rPr>
           </w:pPr>
-          <w:hyperlink w:anchor="_Toc135130847" w:history="1">
+          <w:hyperlink w:anchor="_Toc135132023" w:history="1">
             <w:r>
               <w:rPr>
                 <w:rStyle w:val="Hyperlink"/>
@@ -584,7 +726,7 @@
                 <w:noProof/>
                 <w:webHidden/>
               </w:rPr>
-              <w:instrText xml:space="preserve"> PAGEREF _Toc135130847 \h </w:instrText>
+              <w:instrText xml:space="preserve"> PAGEREF _Toc135132023 \h </w:instrText>
             </w:r>
             <w:r>
               <w:rPr>
@@ -604,7 +746,7 @@
                 <w:noProof/>
                 <w:webHidden/>
               </w:rPr>
-              <w:t>4</w:t>
+              <w:t>5</w:t>
             </w:r>
             <w:r>
               <w:rPr>
@@ -627,7 +769,7 @@
               <w:lang w:eastAsia="pt-BR"/>
             </w:rPr>
           </w:pPr>
-          <w:hyperlink w:anchor="_Toc135130848" w:history="1">
+          <w:hyperlink w:anchor="_Toc135132024" w:history="1">
             <w:r>
               <w:rPr>
                 <w:rStyle w:val="Hyperlink"/>
@@ -654,7 +796,7 @@
                 <w:noProof/>
                 <w:webHidden/>
               </w:rPr>
-              <w:instrText xml:space="preserve"> PAGEREF _Toc135130848 \h </w:instrText>
+              <w:instrText xml:space="preserve"> PAGEREF _Toc135132024 \h </w:instrText>
             </w:r>
             <w:r>
               <w:rPr>
@@ -674,7 +816,7 @@
                 <w:noProof/>
                 <w:webHidden/>
               </w:rPr>
-              <w:t>4</w:t>
+              <w:t>5</w:t>
             </w:r>
             <w:r>
               <w:rPr>
@@ -686,6 +828,9 @@
           </w:hyperlink>
         </w:p>
         <w:p>
+          <w:pPr>
+            <w:jc w:val="both"/>
+          </w:pPr>
           <w:r>
             <w:rPr>
               <w:b/>
@@ -703,6 +848,7 @@
     </w:p>
     <w:p>
       <w:pPr>
+        <w:jc w:val="both"/>
         <w:rPr>
           <w:rFonts w:asciiTheme="majorHAnsi" w:eastAsiaTheme="majorEastAsia" w:hAnsiTheme="majorHAnsi" w:cstheme="majorBidi"/>
           <w:color w:val="2F5496" w:themeColor="accent1" w:themeShade="BF"/>
@@ -717,8 +863,9 @@
     <w:p>
       <w:pPr>
         <w:pStyle w:val="Ttulo1"/>
-      </w:pPr>
-      <w:bookmarkStart w:id="1" w:name="_Toc135130842"/>
+        <w:jc w:val="both"/>
+      </w:pPr>
+      <w:bookmarkStart w:id="1" w:name="_Toc135132016"/>
       <w:r>
         <w:lastRenderedPageBreak/>
         <w:t>1 – Breve descrição</w:t>
@@ -821,7 +968,13 @@
         <w:jc w:val="both"/>
       </w:pPr>
       <w:r>
-        <w:t>0 Procedure (apesar de que 2 métodos foram duplicados com o uso de proc. apenas para demonstrar que se conhece o uso de SQL e proc.)</w:t>
+        <w:t>0</w:t>
+      </w:r>
+      <w:r>
+        <w:t>(ZERO)</w:t>
+      </w:r>
+      <w:r>
+        <w:t xml:space="preserve"> Procedure (apesar de que 2 métodos foram duplicados com o uso de proc. apenas para demonstrar que se conhece o uso de SQL e proc.)</w:t>
       </w:r>
     </w:p>
     <w:p>
@@ -842,15 +995,7 @@
         <w:jc w:val="both"/>
       </w:pPr>
       <w:r>
-        <w:t xml:space="preserve">O serviço de api está on </w:t>
-      </w:r>
-      <w:proofErr w:type="spellStart"/>
-      <w:r>
-        <w:t>line</w:t>
-      </w:r>
-      <w:proofErr w:type="spellEnd"/>
-      <w:r>
-        <w:t xml:space="preserve"> disponibilizado e publicados nos endereços:</w:t>
+        <w:t>O serviço de api está on line disponibilizado e publicados nos endereços:</w:t>
       </w:r>
     </w:p>
     <w:p>
@@ -897,16 +1042,203 @@
     </w:p>
     <w:p>
       <w:pPr>
+        <w:jc w:val="both"/>
+      </w:pPr>
+      <w:r>
+        <w:t xml:space="preserve">Os códigos algumas classes </w:t>
+      </w:r>
+      <w:r>
+        <w:t>contêm</w:t>
+      </w:r>
+      <w:r>
+        <w:t xml:space="preserve"> observação do porquê de cada uso ou situação no método comentado.</w:t>
+      </w:r>
+    </w:p>
+    <w:p>
+      <w:pPr>
         <w:pStyle w:val="Ttulo1"/>
-      </w:pPr>
-      <w:bookmarkStart w:id="2" w:name="_Toc135130843"/>
-      <w:r>
-        <w:t>2 – O que foi implementado?</w:t>
-      </w:r>
-    </w:p>
-    <w:p>
+        <w:jc w:val="both"/>
+      </w:pPr>
+      <w:bookmarkStart w:id="2" w:name="_Toc135132017"/>
+      <w:r>
+        <w:t>2</w:t>
+      </w:r>
+      <w:r>
+        <w:t xml:space="preserve"> – </w:t>
+      </w:r>
+      <w:r>
+        <w:t>Repositórios de Código</w:t>
+      </w:r>
+      <w:bookmarkEnd w:id="2"/>
+    </w:p>
+    <w:p>
+      <w:pPr>
+        <w:jc w:val="both"/>
+      </w:pPr>
+      <w:r>
+        <w:t xml:space="preserve">No </w:t>
+      </w:r>
+      <w:r>
+        <w:t>Repositório Git.</w:t>
+      </w:r>
+      <w:r>
+        <w:t xml:space="preserve"> Subi o projeto principal, e lá tem também a minha biblioteca de apoio para uso em sistemas.</w:t>
+      </w:r>
+    </w:p>
+    <w:p>
+      <w:pPr>
+        <w:jc w:val="both"/>
+      </w:pPr>
+      <w:r>
+        <w:t>O repositório deste projeto está em:</w:t>
+      </w:r>
+    </w:p>
+    <w:p>
+      <w:pPr>
+        <w:jc w:val="both"/>
+      </w:pPr>
+      <w:hyperlink r:id="rId8" w:history="1">
+        <w:r>
+          <w:rPr>
+            <w:rStyle w:val="Hyperlink"/>
+          </w:rPr>
+          <w:t>https://github.com/Humberfrench/FluxoDeCaixa</w:t>
+        </w:r>
+      </w:hyperlink>
+    </w:p>
+    <w:p>
+      <w:pPr>
+        <w:jc w:val="both"/>
+      </w:pPr>
+    </w:p>
+    <w:p>
+      <w:pPr>
+        <w:jc w:val="both"/>
+      </w:pPr>
+      <w:r>
+        <w:t>O repositório dos pacotes nugget está em:</w:t>
+      </w:r>
+    </w:p>
+    <w:p>
+      <w:pPr>
+        <w:jc w:val="both"/>
+      </w:pPr>
+      <w:hyperlink r:id="rId9" w:history="1">
+        <w:r>
+          <w:rPr>
+            <w:rStyle w:val="Hyperlink"/>
+          </w:rPr>
+          <w:t>https://github.com/Humberfrench/DietTools</w:t>
+        </w:r>
+      </w:hyperlink>
+      <w:r>
+        <w:t xml:space="preserve">  (Dietcode é o nome fantasia da minha empresa e marca)</w:t>
+      </w:r>
+    </w:p>
+    <w:p>
+      <w:pPr>
+        <w:jc w:val="both"/>
+      </w:pPr>
+      <w:r>
+        <w:t>Existe outros repositórios alguns 100% implementados e outros foram estudos que demonstram a referência e o conhecimento de DDD. O meu conhecimento foi obtido através do Eduardo Pires, um colega de trabalho disponibilizou ao entrarmos na empresa os vídeos dele falando disso para entrarmos no conhecimento e aplicar o uso da metodologia para isso</w:t>
+      </w:r>
+    </w:p>
+    <w:p>
+      <w:pPr>
+        <w:jc w:val="both"/>
+      </w:pPr>
+      <w:r>
+        <w:rPr>
+          <w:b/>
+          <w:bCs/>
+        </w:rPr>
+        <w:t>Jack</w:t>
+      </w:r>
+      <w:r>
+        <w:t xml:space="preserve"> – Para controle de assistência social e distribuição de sacolinhas de Natal, usando DDD, NHibernate, Net Framework, Ajax com Javascript.</w:t>
+      </w:r>
+    </w:p>
+    <w:p>
+      <w:pPr>
+        <w:jc w:val="both"/>
+      </w:pPr>
+      <w:r>
+        <w:rPr>
+          <w:b/>
+          <w:bCs/>
+        </w:rPr>
+        <w:t>Reddington</w:t>
+      </w:r>
+      <w:r>
+        <w:t xml:space="preserve"> – Para gerenciamento de escolinha de moral cristã a alunos da assistência social</w:t>
+      </w:r>
+      <w:r>
+        <w:t>, usando DDD, NHibernate, Net Framework, Ajax com Javascript</w:t>
+      </w:r>
+      <w:r>
+        <w:t>.</w:t>
+      </w:r>
+    </w:p>
+    <w:p>
+      <w:pPr>
+        <w:jc w:val="both"/>
+      </w:pPr>
+      <w:r>
+        <w:rPr>
+          <w:b/>
+          <w:bCs/>
+        </w:rPr>
+        <w:lastRenderedPageBreak/>
+        <w:t>Jim Halpert</w:t>
+      </w:r>
+      <w:r>
+        <w:t xml:space="preserve"> – Incompleto. Api em Net Core para munir o sistema front de estudo </w:t>
+      </w:r>
+      <w:proofErr w:type="gramStart"/>
+      <w:r>
+        <w:t>usando Angular</w:t>
+      </w:r>
+      <w:proofErr w:type="gramEnd"/>
+      <w:r>
+        <w:t xml:space="preserve"> (não finalizado, era estudo)</w:t>
+      </w:r>
+    </w:p>
+    <w:p>
+      <w:pPr>
+        <w:jc w:val="both"/>
+      </w:pPr>
+    </w:p>
+    <w:p>
+      <w:pPr>
+        <w:pStyle w:val="Ttulo1"/>
+        <w:jc w:val="both"/>
+      </w:pPr>
+      <w:bookmarkStart w:id="3" w:name="_Toc135132018"/>
+      <w:r>
+        <w:t>3 – O que foi implementado?</w:t>
+      </w:r>
+      <w:bookmarkEnd w:id="3"/>
+    </w:p>
+    <w:p>
+      <w:pPr>
+        <w:jc w:val="both"/>
+      </w:pPr>
       <w:r>
         <w:t>Foi pedido um fluxo de caixa, com lançamentos que sejam especificados a débito ou crédito. E que fosse mostrado um relatório consolidado. Como foi pedido um serviço, foi disponibilizado um serviço REST com o que foi pedido e mais algumas informações</w:t>
+      </w:r>
+    </w:p>
+    <w:p>
+      <w:pPr>
+        <w:jc w:val="both"/>
+      </w:pPr>
+      <w:r>
+        <w:t xml:space="preserve">O modelo de implementação é que o cliente faz o lançamento se ele erra, pode ser um cancelamento, não excluímos o </w:t>
+      </w:r>
+      <w:r>
+        <w:t>lançamento, apenas</w:t>
+      </w:r>
+      <w:r>
+        <w:t xml:space="preserve"> marcamos como estornado, para até um controle interno de estornos do dia/mês.</w:t>
       </w:r>
     </w:p>
     <w:p>
@@ -916,6 +1248,7 @@
           <w:ilvl w:val="0"/>
           <w:numId w:val="4"/>
         </w:numPr>
+        <w:jc w:val="both"/>
       </w:pPr>
       <w:r>
         <w:t xml:space="preserve">Lançamento (débito ou crédito, valor e descrição) </w:t>
@@ -934,12 +1267,16 @@
           <w:ilvl w:val="0"/>
           <w:numId w:val="4"/>
         </w:numPr>
+        <w:jc w:val="both"/>
       </w:pPr>
       <w:r>
         <w:t>Estorno – para cancelar o lançamento</w:t>
       </w:r>
     </w:p>
     <w:p>
+      <w:pPr>
+        <w:jc w:val="both"/>
+      </w:pPr>
       <w:r>
         <w:t>Relatórios/Consultas</w:t>
       </w:r>
@@ -951,6 +1288,7 @@
           <w:ilvl w:val="0"/>
           <w:numId w:val="5"/>
         </w:numPr>
+        <w:jc w:val="both"/>
       </w:pPr>
       <w:r>
         <w:t>Todos os lançamentos do dia</w:t>
@@ -963,9 +1301,10 @@
           <w:ilvl w:val="0"/>
           <w:numId w:val="5"/>
         </w:numPr>
-      </w:pPr>
-      <w:r>
-        <w:t>Todos os lançamentos de uma data específica</w:t>
+        <w:jc w:val="both"/>
+      </w:pPr>
+      <w:r>
+        <w:t>Todos os estornos do dia</w:t>
       </w:r>
     </w:p>
     <w:p>
@@ -975,9 +1314,10 @@
           <w:ilvl w:val="0"/>
           <w:numId w:val="5"/>
         </w:numPr>
-      </w:pPr>
-      <w:r>
-        <w:t>Todos os lançamentos de um rangem de datas</w:t>
+        <w:jc w:val="both"/>
+      </w:pPr>
+      <w:r>
+        <w:t>Todos os lançamentos de uma data específica</w:t>
       </w:r>
     </w:p>
     <w:p>
@@ -987,12 +1327,10 @@
           <w:ilvl w:val="0"/>
           <w:numId w:val="5"/>
         </w:numPr>
-      </w:pPr>
-      <w:r>
-        <w:t>Todos os lançamentos</w:t>
-      </w:r>
-      <w:r>
-        <w:t xml:space="preserve"> de um mês (para isso entra mês e ano para evitar conflito)</w:t>
+        <w:jc w:val="both"/>
+      </w:pPr>
+      <w:r>
+        <w:t>Todos os lançamentos de um rangem de datas</w:t>
       </w:r>
     </w:p>
     <w:p>
@@ -1002,15 +1340,10 @@
           <w:ilvl w:val="0"/>
           <w:numId w:val="5"/>
         </w:numPr>
-      </w:pPr>
-      <w:r>
-        <w:t xml:space="preserve">Relatório consolidado do dia </w:t>
-      </w:r>
-      <w:r>
-        <w:rPr>
-          <w:strike/>
-        </w:rPr>
-        <w:t>(foi pedido)</w:t>
+        <w:jc w:val="both"/>
+      </w:pPr>
+      <w:r>
+        <w:t>Todos os lançamentos de um mês (para isso entra mês e ano para evitar conflito)</w:t>
       </w:r>
     </w:p>
     <w:p>
@@ -1020,12 +1353,10 @@
           <w:ilvl w:val="0"/>
           <w:numId w:val="5"/>
         </w:numPr>
-      </w:pPr>
-      <w:r>
-        <w:t>Relatório consolidado d</w:t>
-      </w:r>
-      <w:r>
-        <w:t>e uma data especifica</w:t>
+        <w:jc w:val="both"/>
+      </w:pPr>
+      <w:r>
+        <w:t>Todos os estornos de um mês (para isso entra mês e ano para evitar conflito)</w:t>
       </w:r>
     </w:p>
     <w:p>
@@ -1035,12 +1366,16 @@
           <w:ilvl w:val="0"/>
           <w:numId w:val="5"/>
         </w:numPr>
-      </w:pPr>
-      <w:r>
-        <w:t>Relatório consolidado do dia</w:t>
-      </w:r>
-      <w:r>
-        <w:t xml:space="preserve"> – duplicado, porém usando SQL Server procedure</w:t>
+        <w:jc w:val="both"/>
+      </w:pPr>
+      <w:r>
+        <w:t xml:space="preserve">Relatório consolidado do dia </w:t>
+      </w:r>
+      <w:r>
+        <w:rPr>
+          <w:strike/>
+        </w:rPr>
+        <w:t>(foi pedido)</w:t>
       </w:r>
     </w:p>
     <w:p>
@@ -1050,6 +1385,39 @@
           <w:ilvl w:val="0"/>
           <w:numId w:val="5"/>
         </w:numPr>
+        <w:jc w:val="both"/>
+      </w:pPr>
+      <w:r>
+        <w:t>Relatório consolidado d</w:t>
+      </w:r>
+      <w:r>
+        <w:t>e uma data especifica</w:t>
+      </w:r>
+    </w:p>
+    <w:p>
+      <w:pPr>
+        <w:pStyle w:val="PargrafodaLista"/>
+        <w:numPr>
+          <w:ilvl w:val="0"/>
+          <w:numId w:val="5"/>
+        </w:numPr>
+        <w:jc w:val="both"/>
+      </w:pPr>
+      <w:r>
+        <w:t>Relatório consolidado do dia</w:t>
+      </w:r>
+      <w:r>
+        <w:t xml:space="preserve"> – duplicado, porém usando SQL Server procedure</w:t>
+      </w:r>
+    </w:p>
+    <w:p>
+      <w:pPr>
+        <w:pStyle w:val="PargrafodaLista"/>
+        <w:numPr>
+          <w:ilvl w:val="0"/>
+          <w:numId w:val="5"/>
+        </w:numPr>
+        <w:jc w:val="both"/>
       </w:pPr>
       <w:r>
         <w:t xml:space="preserve">Relatório consolidado de uma data especifica – duplicado, </w:t>
@@ -1069,15 +1437,116 @@
     </w:p>
     <w:p>
       <w:pPr>
+        <w:jc w:val="both"/>
+      </w:pPr>
+      <w:r>
+        <w:t xml:space="preserve">Foi colocado um serviço de autenticação, não implementado, apenas para constar, porém se isso fosse realmente um </w:t>
+      </w:r>
+      <w:r>
+        <w:t>sistema etc.</w:t>
+      </w:r>
+      <w:r>
+        <w:t>, este seria um item obrigatório</w:t>
+      </w:r>
+    </w:p>
+    <w:p>
+      <w:pPr>
+        <w:jc w:val="both"/>
+      </w:pPr>
+      <w:r>
+        <w:t>Um item de Ping que apenas avalia a disponibilidade do serviço</w:t>
+      </w:r>
+    </w:p>
+    <w:p>
+      <w:pPr>
+        <w:jc w:val="both"/>
+      </w:pPr>
+      <w:r>
+        <w:t>Como os métodos estão abertos poderão ser chamados via Swagger por aqui:</w:t>
+      </w:r>
+    </w:p>
+    <w:p>
+      <w:pPr>
+        <w:jc w:val="both"/>
+      </w:pPr>
+      <w:hyperlink r:id="rId10" w:history="1">
+        <w:r>
+          <w:rPr>
+            <w:rStyle w:val="Hyperlink"/>
+          </w:rPr>
+          <w:t>http://fluxodecaixa.dietcode.com.br/swagger/index.html</w:t>
+        </w:r>
+      </w:hyperlink>
+    </w:p>
+    <w:p>
+      <w:pPr>
+        <w:jc w:val="both"/>
+      </w:pPr>
+      <w:hyperlink r:id="rId11" w:history="1">
+        <w:r>
+          <w:rPr>
+            <w:rStyle w:val="Hyperlink"/>
+          </w:rPr>
+          <w:t>https://fluxodecaixa.french.com.br/swagger/index.html</w:t>
+        </w:r>
+      </w:hyperlink>
+    </w:p>
+    <w:p>
+      <w:pPr>
+        <w:jc w:val="both"/>
+      </w:pPr>
+      <w:r>
+        <w:t>OU pelo endereço que for implantado no servidor corporativo:</w:t>
+      </w:r>
+    </w:p>
+    <w:p>
+      <w:pPr>
+        <w:jc w:val="both"/>
+      </w:pPr>
+      <w:hyperlink w:history="1">
+        <w:r>
+          <w:rPr>
+            <w:rStyle w:val="Hyperlink"/>
+          </w:rPr>
+          <w:t>http://&lt;endereco_corp_do_site&gt;/</w:t>
+        </w:r>
+        <w:r>
+          <w:rPr>
+            <w:rStyle w:val="Hyperlink"/>
+          </w:rPr>
+          <w:t>/swagger/index.html</w:t>
+        </w:r>
+      </w:hyperlink>
+    </w:p>
+    <w:p>
+      <w:pPr>
+        <w:jc w:val="both"/>
+      </w:pPr>
+      <w:r>
+        <w:t xml:space="preserve">Devido ao tempo </w:t>
+      </w:r>
+      <w:proofErr w:type="gramStart"/>
+      <w:r>
+        <w:t>não  implementei</w:t>
+      </w:r>
+      <w:proofErr w:type="gramEnd"/>
+      <w:r>
+        <w:t xml:space="preserve"> telas, pois até nem foi pedido, e nem fiz um executável pra chamadas, pois como está sem auth e aberto não vi necessidade</w:t>
+      </w:r>
+    </w:p>
+    <w:p>
+      <w:pPr>
         <w:pStyle w:val="Ttulo1"/>
-      </w:pPr>
-      <w:r>
-        <w:t>3</w:t>
+        <w:jc w:val="both"/>
+      </w:pPr>
+      <w:bookmarkStart w:id="4" w:name="_Toc135132019"/>
+      <w:r>
+        <w:t>4</w:t>
       </w:r>
       <w:r>
         <w:t xml:space="preserve"> – Camadas</w:t>
       </w:r>
-      <w:bookmarkEnd w:id="2"/>
+      <w:bookmarkEnd w:id="4"/>
     </w:p>
     <w:p>
       <w:pPr>
@@ -1149,15 +1618,16 @@
     <w:p>
       <w:pPr>
         <w:pStyle w:val="Ttulo1"/>
-      </w:pPr>
-      <w:bookmarkStart w:id="3" w:name="_Toc135130844"/>
-      <w:r>
-        <w:t>4</w:t>
+        <w:jc w:val="both"/>
+      </w:pPr>
+      <w:bookmarkStart w:id="5" w:name="_Toc135132020"/>
+      <w:r>
+        <w:t>5</w:t>
       </w:r>
       <w:r>
         <w:t xml:space="preserve"> -Pacotes Externos</w:t>
       </w:r>
-      <w:bookmarkEnd w:id="3"/>
+      <w:bookmarkEnd w:id="5"/>
     </w:p>
     <w:p>
       <w:pPr>
@@ -1285,59 +1755,13 @@
           <w:szCs w:val="20"/>
         </w:rPr>
       </w:pPr>
-      <w:proofErr w:type="spellStart"/>
       <w:r>
         <w:rPr>
           <w:rFonts w:ascii="Cascadia Code SemiBold" w:hAnsi="Cascadia Code SemiBold"/>
           <w:sz w:val="20"/>
           <w:szCs w:val="20"/>
         </w:rPr>
-        <w:t>dotnet</w:t>
-      </w:r>
-      <w:proofErr w:type="spellEnd"/>
-      <w:r>
-        <w:rPr>
-          <w:rFonts w:ascii="Cascadia Code SemiBold" w:hAnsi="Cascadia Code SemiBold"/>
-          <w:sz w:val="20"/>
-          <w:szCs w:val="20"/>
-        </w:rPr>
-        <w:t xml:space="preserve"> </w:t>
-      </w:r>
-      <w:proofErr w:type="spellStart"/>
-      <w:r>
-        <w:rPr>
-          <w:rFonts w:ascii="Cascadia Code SemiBold" w:hAnsi="Cascadia Code SemiBold"/>
-          <w:sz w:val="20"/>
-          <w:szCs w:val="20"/>
-        </w:rPr>
-        <w:t>nuget</w:t>
-      </w:r>
-      <w:proofErr w:type="spellEnd"/>
-      <w:r>
-        <w:rPr>
-          <w:rFonts w:ascii="Cascadia Code SemiBold" w:hAnsi="Cascadia Code SemiBold"/>
-          <w:sz w:val="20"/>
-          <w:szCs w:val="20"/>
-        </w:rPr>
-        <w:t xml:space="preserve"> </w:t>
-      </w:r>
-      <w:proofErr w:type="spellStart"/>
-      <w:r>
-        <w:rPr>
-          <w:rFonts w:ascii="Cascadia Code SemiBold" w:hAnsi="Cascadia Code SemiBold"/>
-          <w:sz w:val="20"/>
-          <w:szCs w:val="20"/>
-        </w:rPr>
-        <w:t>push</w:t>
-      </w:r>
-      <w:proofErr w:type="spellEnd"/>
-      <w:r>
-        <w:rPr>
-          <w:rFonts w:ascii="Cascadia Code SemiBold" w:hAnsi="Cascadia Code SemiBold"/>
-          <w:sz w:val="20"/>
-          <w:szCs w:val="20"/>
-        </w:rPr>
-        <w:t xml:space="preserve"> </w:t>
+        <w:t xml:space="preserve">dotnet nuget push </w:t>
       </w:r>
       <w:r>
         <w:rPr>
@@ -1355,7 +1779,6 @@
         </w:rPr>
         <w:t>\</w:t>
       </w:r>
-      <w:proofErr w:type="spellStart"/>
       <w:proofErr w:type="gramStart"/>
       <w:r>
         <w:rPr>
@@ -1373,7 +1796,6 @@
         </w:rPr>
         <w:t>.nupkg</w:t>
       </w:r>
-      <w:proofErr w:type="spellEnd"/>
       <w:proofErr w:type="gramEnd"/>
       <w:r>
         <w:rPr>
@@ -1428,15 +1850,16 @@
     <w:p>
       <w:pPr>
         <w:pStyle w:val="Ttulo1"/>
-      </w:pPr>
-      <w:bookmarkStart w:id="4" w:name="_Toc135130845"/>
-      <w:r>
-        <w:t>5</w:t>
+        <w:jc w:val="both"/>
+      </w:pPr>
+      <w:bookmarkStart w:id="6" w:name="_Toc135132021"/>
+      <w:r>
+        <w:t>6</w:t>
       </w:r>
       <w:r>
         <w:t xml:space="preserve"> – Setup Banco</w:t>
       </w:r>
-      <w:bookmarkEnd w:id="4"/>
+      <w:bookmarkEnd w:id="6"/>
     </w:p>
     <w:p>
       <w:pPr>
@@ -1468,15 +1891,16 @@
     <w:p>
       <w:pPr>
         <w:pStyle w:val="Ttulo1"/>
-      </w:pPr>
-      <w:bookmarkStart w:id="5" w:name="_Toc135130846"/>
-      <w:r>
-        <w:t>6</w:t>
+        <w:jc w:val="both"/>
+      </w:pPr>
+      <w:bookmarkStart w:id="7" w:name="_Toc135132022"/>
+      <w:r>
+        <w:t>7</w:t>
       </w:r>
       <w:r>
         <w:t xml:space="preserve"> – Instalação</w:t>
       </w:r>
-      <w:bookmarkEnd w:id="5"/>
+      <w:bookmarkEnd w:id="7"/>
     </w:p>
     <w:p>
       <w:pPr>
@@ -1489,12 +1913,13 @@
     <w:p>
       <w:pPr>
         <w:pStyle w:val="Ttulo2"/>
-      </w:pPr>
-      <w:bookmarkStart w:id="6" w:name="_Toc135130847"/>
+        <w:jc w:val="both"/>
+      </w:pPr>
+      <w:bookmarkStart w:id="8" w:name="_Toc135132023"/>
       <w:r>
         <w:t>Método um</w:t>
       </w:r>
-      <w:bookmarkEnd w:id="6"/>
+      <w:bookmarkEnd w:id="8"/>
     </w:p>
     <w:p>
       <w:pPr>
@@ -1515,6 +1940,7 @@
     <w:p>
       <w:pPr>
         <w:pStyle w:val="Ttulo2"/>
+        <w:jc w:val="both"/>
         <w:rPr>
           <w:rFonts w:asciiTheme="minorHAnsi" w:eastAsiaTheme="minorHAnsi" w:hAnsiTheme="minorHAnsi" w:cstheme="minorBidi"/>
           <w:color w:val="auto"/>
@@ -1522,26 +1948,18 @@
           <w:szCs w:val="22"/>
         </w:rPr>
       </w:pPr>
-      <w:bookmarkStart w:id="7" w:name="_Toc135130848"/>
+      <w:bookmarkStart w:id="9" w:name="_Toc135132024"/>
       <w:r>
         <w:t>Método dois</w:t>
       </w:r>
-      <w:bookmarkEnd w:id="7"/>
-    </w:p>
-    <w:p>
-      <w:pPr>
-        <w:jc w:val="both"/>
-      </w:pPr>
-      <w:r>
-        <w:t>Criar o banco no servidor interno ai de vocês. Pode ser via restore do banco (.</w:t>
-      </w:r>
-      <w:proofErr w:type="spellStart"/>
-      <w:r>
-        <w:t>bak</w:t>
-      </w:r>
-      <w:proofErr w:type="spellEnd"/>
-      <w:r>
-        <w:t>) que está disponibilizado junto do repositório Git. OU rodar os scripts na ordem:</w:t>
+      <w:bookmarkEnd w:id="9"/>
+    </w:p>
+    <w:p>
+      <w:pPr>
+        <w:jc w:val="both"/>
+      </w:pPr>
+      <w:r>
+        <w:t>Criar o banco no servidor interno ai de vocês. Pode ser via restore do banco (.bak) que está disponibilizado junto do repositório Git. OU rodar os scripts na ordem:</w:t>
       </w:r>
     </w:p>
     <w:p>
@@ -1607,15 +2025,32 @@
         <w:jc w:val="both"/>
       </w:pPr>
       <w:r>
-        <w:t xml:space="preserve">Após isso alterar a string de conexão para conectar-se ao banco. É preciso dar permissões ao usuário que vai ser usado para conectar a essa base. Poderia usar o SA </w:t>
-      </w:r>
-      <w:proofErr w:type="gramStart"/>
-      <w:r>
-        <w:t>porem</w:t>
-      </w:r>
-      <w:proofErr w:type="gramEnd"/>
+        <w:t xml:space="preserve">Após isso alterar a string de conexão para conectar-se ao banco. É preciso dar permissões ao usuário que vai ser usado para conectar a essa base. Poderia usar </w:t>
+      </w:r>
+      <w:r>
+        <w:t>o SA,</w:t>
+      </w:r>
+      <w:r>
+        <w:t xml:space="preserve"> </w:t>
+      </w:r>
+      <w:r>
+        <w:t>porém</w:t>
+      </w:r>
       <w:r>
         <w:t>, como é um ambiente corporativo é descartada esta possibilidade.</w:t>
+      </w:r>
+    </w:p>
+    <w:p>
+      <w:pPr>
+        <w:jc w:val="both"/>
+      </w:pPr>
+    </w:p>
+    <w:p>
+      <w:pPr>
+        <w:jc w:val="both"/>
+      </w:pPr>
+      <w:r>
+        <w:t xml:space="preserve">Peço desculpas por não disponibilizar via container que é algo que ainda está fora do meu conhecimento. Mas caso a parceria nossa vingue, me proponho a entender e conhecer melhor a fundo e trabalhar conforme os padrões e metodologias da empresa. </w:t>
       </w:r>
     </w:p>
     <w:p>
@@ -2643,7 +3078,6 @@
   <w:style w:type="character" w:default="1" w:styleId="Fontepargpadro">
     <w:name w:val="Default Paragraph Font"/>
     <w:uiPriority w:val="1"/>
-    <w:semiHidden/>
     <w:unhideWhenUsed/>
   </w:style>
   <w:style w:type="table" w:default="1" w:styleId="Tabelanormal">

</xml_diff>

<commit_message>
controlers separacao e ajuste docs
</commit_message>
<xml_diff>
--- a/Docs/Fluxo de Caixa.docx
+++ b/Docs/Fluxo de Caixa.docx
@@ -89,6 +89,15 @@
     </w:p>
     <w:sdt>
       <w:sdtPr>
+        <w:rPr>
+          <w:rFonts w:asciiTheme="minorHAnsi" w:eastAsiaTheme="minorHAnsi" w:hAnsiTheme="minorHAnsi" w:cstheme="minorBidi"/>
+          <w:color w:val="auto"/>
+          <w:kern w:val="2"/>
+          <w:sz w:val="22"/>
+          <w:szCs w:val="22"/>
+          <w:lang w:eastAsia="en-US"/>
+          <w14:ligatures w14:val="standardContextual"/>
+        </w:rPr>
         <w:id w:val="914588118"/>
         <w:docPartObj>
           <w:docPartGallery w:val="Table of Contents"/>
@@ -97,15 +106,8 @@
       </w:sdtPr>
       <w:sdtEndPr>
         <w:rPr>
-          <w:rFonts w:asciiTheme="minorHAnsi" w:eastAsiaTheme="minorHAnsi" w:hAnsiTheme="minorHAnsi" w:cstheme="minorBidi"/>
           <w:b/>
           <w:bCs/>
-          <w:color w:val="auto"/>
-          <w:kern w:val="2"/>
-          <w:sz w:val="22"/>
-          <w:szCs w:val="22"/>
-          <w:lang w:eastAsia="en-US"/>
-          <w14:ligatures w14:val="standardContextual"/>
         </w:rPr>
       </w:sdtEndPr>
       <w:sdtContent>
@@ -124,6 +126,7 @@
             <w:tabs>
               <w:tab w:val="right" w:leader="dot" w:pos="8494"/>
             </w:tabs>
+            <w:jc w:val="both"/>
             <w:rPr>
               <w:rFonts w:eastAsiaTheme="minorEastAsia"/>
               <w:noProof/>
@@ -203,6 +206,7 @@
             <w:tabs>
               <w:tab w:val="right" w:leader="dot" w:pos="8494"/>
             </w:tabs>
+            <w:jc w:val="both"/>
             <w:rPr>
               <w:rFonts w:eastAsiaTheme="minorEastAsia"/>
               <w:noProof/>
@@ -273,6 +277,7 @@
             <w:tabs>
               <w:tab w:val="right" w:leader="dot" w:pos="8494"/>
             </w:tabs>
+            <w:jc w:val="both"/>
             <w:rPr>
               <w:rFonts w:eastAsiaTheme="minorEastAsia"/>
               <w:noProof/>
@@ -343,6 +348,7 @@
             <w:tabs>
               <w:tab w:val="right" w:leader="dot" w:pos="8494"/>
             </w:tabs>
+            <w:jc w:val="both"/>
             <w:rPr>
               <w:rFonts w:eastAsiaTheme="minorEastAsia"/>
               <w:noProof/>
@@ -413,6 +419,7 @@
             <w:tabs>
               <w:tab w:val="right" w:leader="dot" w:pos="8494"/>
             </w:tabs>
+            <w:jc w:val="both"/>
             <w:rPr>
               <w:rFonts w:eastAsiaTheme="minorEastAsia"/>
               <w:noProof/>
@@ -483,6 +490,7 @@
             <w:tabs>
               <w:tab w:val="right" w:leader="dot" w:pos="8494"/>
             </w:tabs>
+            <w:jc w:val="both"/>
             <w:rPr>
               <w:rFonts w:eastAsiaTheme="minorEastAsia"/>
               <w:noProof/>
@@ -553,6 +561,7 @@
             <w:tabs>
               <w:tab w:val="right" w:leader="dot" w:pos="8494"/>
             </w:tabs>
+            <w:jc w:val="both"/>
             <w:rPr>
               <w:rFonts w:eastAsiaTheme="minorEastAsia"/>
               <w:noProof/>
@@ -623,6 +632,7 @@
             <w:tabs>
               <w:tab w:val="right" w:leader="dot" w:pos="8494"/>
             </w:tabs>
+            <w:jc w:val="both"/>
             <w:rPr>
               <w:rFonts w:eastAsiaTheme="minorEastAsia"/>
               <w:noProof/>
@@ -693,6 +703,7 @@
             <w:tabs>
               <w:tab w:val="right" w:leader="dot" w:pos="8494"/>
             </w:tabs>
+            <w:jc w:val="both"/>
             <w:rPr>
               <w:rFonts w:eastAsiaTheme="minorEastAsia"/>
               <w:noProof/>
@@ -763,6 +774,7 @@
             <w:tabs>
               <w:tab w:val="right" w:leader="dot" w:pos="8494"/>
             </w:tabs>
+            <w:jc w:val="both"/>
             <w:rPr>
               <w:rFonts w:eastAsiaTheme="minorEastAsia"/>
               <w:noProof/>
@@ -995,7 +1007,15 @@
         <w:jc w:val="both"/>
       </w:pPr>
       <w:r>
-        <w:t>O serviço de api está on line disponibilizado e publicados nos endereços:</w:t>
+        <w:t xml:space="preserve">O serviço de api está on </w:t>
+      </w:r>
+      <w:proofErr w:type="spellStart"/>
+      <w:r>
+        <w:t>line</w:t>
+      </w:r>
+      <w:proofErr w:type="spellEnd"/>
+      <w:r>
+        <w:t xml:space="preserve"> disponibilizado e publicados nos endereços:</w:t>
       </w:r>
     </w:p>
     <w:p>
@@ -1061,10 +1081,7 @@
       </w:pPr>
       <w:bookmarkStart w:id="2" w:name="_Toc135132017"/>
       <w:r>
-        <w:t>2</w:t>
-      </w:r>
-      <w:r>
-        <w:t xml:space="preserve"> – </w:t>
+        <w:t xml:space="preserve">2 – </w:t>
       </w:r>
       <w:r>
         <w:t>Repositórios de Código</w:t>
@@ -1170,13 +1187,7 @@
         <w:t>Reddington</w:t>
       </w:r>
       <w:r>
-        <w:t xml:space="preserve"> – Para gerenciamento de escolinha de moral cristã a alunos da assistência social</w:t>
-      </w:r>
-      <w:r>
-        <w:t>, usando DDD, NHibernate, Net Framework, Ajax com Javascript</w:t>
-      </w:r>
-      <w:r>
-        <w:t>.</w:t>
+        <w:t xml:space="preserve"> – Para gerenciamento de escolinha de moral cristã a alunos da assistência social, usando DDD, NHibernate, Net Framework, Ajax com Javascript.</w:t>
       </w:r>
     </w:p>
     <w:p>
@@ -1388,10 +1399,7 @@
         <w:jc w:val="both"/>
       </w:pPr>
       <w:r>
-        <w:t>Relatório consolidado d</w:t>
-      </w:r>
-      <w:r>
-        <w:t>e uma data especifica</w:t>
+        <w:t>Relatório consolidado de uma data especifica</w:t>
       </w:r>
     </w:p>
     <w:p>
@@ -1404,10 +1412,7 @@
         <w:jc w:val="both"/>
       </w:pPr>
       <w:r>
-        <w:t>Relatório consolidado do dia</w:t>
-      </w:r>
-      <w:r>
-        <w:t xml:space="preserve"> – duplicado, porém usando SQL Server procedure</w:t>
+        <w:t>Relatório consolidado do dia – duplicado, porém usando SQL Server procedure</w:t>
       </w:r>
     </w:p>
     <w:p>
@@ -1420,19 +1425,7 @@
         <w:jc w:val="both"/>
       </w:pPr>
       <w:r>
-        <w:t xml:space="preserve">Relatório consolidado de uma data especifica – duplicado, </w:t>
-      </w:r>
-      <w:r>
-        <w:t>porém</w:t>
-      </w:r>
-      <w:r>
-        <w:t xml:space="preserve"> usando SQL </w:t>
-      </w:r>
-      <w:r>
-        <w:t>S</w:t>
-      </w:r>
-      <w:r>
-        <w:t>erver procedure</w:t>
+        <w:t>Relatório consolidado de uma data especifica – duplicado, porém usando SQL Server procedure</w:t>
       </w:r>
     </w:p>
     <w:p>
@@ -1508,13 +1501,7 @@
           <w:rPr>
             <w:rStyle w:val="Hyperlink"/>
           </w:rPr>
-          <w:t>http://&lt;endereco_corp_do_site&gt;/</w:t>
-        </w:r>
-        <w:r>
-          <w:rPr>
-            <w:rStyle w:val="Hyperlink"/>
-          </w:rPr>
-          <w:t>/swagger/index.html</w:t>
+          <w:t>http://&lt;endereco_corp_do_site&gt;//swagger/index.html</w:t>
         </w:r>
       </w:hyperlink>
     </w:p>
@@ -1755,63 +1742,79 @@
           <w:szCs w:val="20"/>
         </w:rPr>
       </w:pPr>
+      <w:proofErr w:type="spellStart"/>
       <w:r>
         <w:rPr>
           <w:rFonts w:ascii="Cascadia Code SemiBold" w:hAnsi="Cascadia Code SemiBold"/>
           <w:sz w:val="20"/>
           <w:szCs w:val="20"/>
         </w:rPr>
-        <w:t xml:space="preserve">dotnet nuget push </w:t>
-      </w:r>
+        <w:t>dotnet</w:t>
+      </w:r>
+      <w:proofErr w:type="spellEnd"/>
       <w:r>
         <w:rPr>
           <w:rFonts w:ascii="Cascadia Code SemiBold" w:hAnsi="Cascadia Code SemiBold"/>
           <w:sz w:val="20"/>
           <w:szCs w:val="20"/>
         </w:rPr>
-        <w:t>&lt;caminho do arquivo &gt;</w:t>
-      </w:r>
+        <w:t xml:space="preserve"> </w:t>
+      </w:r>
+      <w:proofErr w:type="spellStart"/>
       <w:r>
         <w:rPr>
           <w:rFonts w:ascii="Cascadia Code SemiBold" w:hAnsi="Cascadia Code SemiBold"/>
           <w:sz w:val="20"/>
           <w:szCs w:val="20"/>
         </w:rPr>
-        <w:t>\</w:t>
-      </w:r>
-      <w:proofErr w:type="gramStart"/>
+        <w:t>nuget</w:t>
+      </w:r>
+      <w:proofErr w:type="spellEnd"/>
       <w:r>
         <w:rPr>
           <w:rFonts w:ascii="Cascadia Code SemiBold" w:hAnsi="Cascadia Code SemiBold"/>
           <w:sz w:val="20"/>
           <w:szCs w:val="20"/>
         </w:rPr>
-        <w:t>nome</w:t>
-      </w:r>
+        <w:t xml:space="preserve"> </w:t>
+      </w:r>
+      <w:proofErr w:type="spellStart"/>
       <w:r>
         <w:rPr>
           <w:rFonts w:ascii="Cascadia Code SemiBold" w:hAnsi="Cascadia Code SemiBold"/>
           <w:sz w:val="20"/>
           <w:szCs w:val="20"/>
         </w:rPr>
-        <w:t>.nupkg</w:t>
-      </w:r>
-      <w:proofErr w:type="gramEnd"/>
+        <w:t>push</w:t>
+      </w:r>
+      <w:proofErr w:type="spellEnd"/>
       <w:r>
         <w:rPr>
           <w:rFonts w:ascii="Cascadia Code SemiBold" w:hAnsi="Cascadia Code SemiBold"/>
           <w:sz w:val="20"/>
           <w:szCs w:val="20"/>
         </w:rPr>
-        <w:t xml:space="preserve"> -s </w:t>
-      </w:r>
+        <w:t xml:space="preserve"> &lt;caminho do arquivo &gt;\</w:t>
+      </w:r>
+      <w:proofErr w:type="spellStart"/>
+      <w:proofErr w:type="gramStart"/>
       <w:r>
         <w:rPr>
           <w:rFonts w:ascii="Cascadia Code SemiBold" w:hAnsi="Cascadia Code SemiBold"/>
           <w:sz w:val="20"/>
           <w:szCs w:val="20"/>
         </w:rPr>
-        <w:t>&lt;caminho destino&gt;</w:t>
+        <w:t>nome.nupkg</w:t>
+      </w:r>
+      <w:proofErr w:type="spellEnd"/>
+      <w:proofErr w:type="gramEnd"/>
+      <w:r>
+        <w:rPr>
+          <w:rFonts w:ascii="Cascadia Code SemiBold" w:hAnsi="Cascadia Code SemiBold"/>
+          <w:sz w:val="20"/>
+          <w:szCs w:val="20"/>
+        </w:rPr>
+        <w:t xml:space="preserve"> -s &lt;caminho destino&gt;</w:t>
       </w:r>
     </w:p>
     <w:p>
@@ -1959,7 +1962,15 @@
         <w:jc w:val="both"/>
       </w:pPr>
       <w:r>
-        <w:t>Criar o banco no servidor interno ai de vocês. Pode ser via restore do banco (.bak) que está disponibilizado junto do repositório Git. OU rodar os scripts na ordem:</w:t>
+        <w:t>Criar o banco no servidor interno ai de vocês. Pode ser via restore do banco (.</w:t>
+      </w:r>
+      <w:proofErr w:type="spellStart"/>
+      <w:r>
+        <w:t>bak</w:t>
+      </w:r>
+      <w:proofErr w:type="spellEnd"/>
+      <w:r>
+        <w:t>) que está disponibilizado junto do repositório Git. OU rodar os scripts na ordem:</w:t>
       </w:r>
     </w:p>
     <w:p>
@@ -1985,10 +1996,7 @@
         <w:jc w:val="both"/>
       </w:pPr>
       <w:r>
-        <w:t>Rodar scripts para criar</w:t>
-      </w:r>
-      <w:r>
-        <w:t xml:space="preserve"> tabela de tipo de lançamento</w:t>
+        <w:t>Rodar scripts para criar tabela de tipo de lançamento</w:t>
       </w:r>
     </w:p>
     <w:p>
@@ -2001,10 +2009,7 @@
         <w:jc w:val="both"/>
       </w:pPr>
       <w:r>
-        <w:t>Rodar scripts para criar</w:t>
-      </w:r>
-      <w:r>
-        <w:t xml:space="preserve"> tabela de Lançamento</w:t>
+        <w:t>Rodar scripts para criar tabela de Lançamento</w:t>
       </w:r>
     </w:p>
     <w:p>
@@ -2060,8 +2065,252 @@
     </w:p>
     <w:p>
       <w:pPr>
-        <w:jc w:val="both"/>
-      </w:pPr>
+        <w:pStyle w:val="Ttulo1"/>
+        <w:jc w:val="both"/>
+      </w:pPr>
+      <w:r>
+        <w:t>8 - Documentação Tecnica</w:t>
+      </w:r>
+    </w:p>
+    <w:p>
+      <w:pPr>
+        <w:jc w:val="both"/>
+      </w:pPr>
+      <w:r>
+        <w:t>Colocando tudo junto no mesmo doc. para evitar o envio de múltiplos arquivos.</w:t>
+      </w:r>
+    </w:p>
+    <w:p>
+      <w:pPr>
+        <w:jc w:val="both"/>
+      </w:pPr>
+    </w:p>
+    <w:p>
+      <w:pPr>
+        <w:pStyle w:val="Ttulo2"/>
+        <w:jc w:val="both"/>
+      </w:pPr>
+      <w:r>
+        <w:lastRenderedPageBreak/>
+        <w:t>8.1 - Diagrama de Banco (básico)</w:t>
+      </w:r>
+    </w:p>
+    <w:p>
+      <w:pPr>
+        <w:jc w:val="both"/>
+      </w:pPr>
+      <w:r>
+        <w:t>O banco contém duas tabelas:</w:t>
+      </w:r>
+    </w:p>
+    <w:p>
+      <w:pPr>
+        <w:jc w:val="both"/>
+      </w:pPr>
+      <w:r>
+        <w:drawing>
+          <wp:inline distT="0" distB="0" distL="0" distR="0" wp14:anchorId="4949AEB2" wp14:editId="13C7D5BC">
+            <wp:extent cx="5400040" cy="2487295"/>
+            <wp:effectExtent l="0" t="0" r="0" b="8255"/>
+            <wp:docPr id="437482641" name="Imagem 1" descr="Diagrama&#10;&#10;Descrição gerada automaticamente"/>
+            <wp:cNvGraphicFramePr>
+              <a:graphicFrameLocks xmlns:a="http://schemas.openxmlformats.org/drawingml/2006/main" noChangeAspect="1"/>
+            </wp:cNvGraphicFramePr>
+            <a:graphic xmlns:a="http://schemas.openxmlformats.org/drawingml/2006/main">
+              <a:graphicData uri="http://schemas.openxmlformats.org/drawingml/2006/picture">
+                <pic:pic xmlns:pic="http://schemas.openxmlformats.org/drawingml/2006/picture">
+                  <pic:nvPicPr>
+                    <pic:cNvPr id="437482641" name="Imagem 1" descr="Diagrama&#10;&#10;Descrição gerada automaticamente"/>
+                    <pic:cNvPicPr/>
+                  </pic:nvPicPr>
+                  <pic:blipFill>
+                    <a:blip r:embed="rId12"/>
+                    <a:stretch>
+                      <a:fillRect/>
+                    </a:stretch>
+                  </pic:blipFill>
+                  <pic:spPr>
+                    <a:xfrm>
+                      <a:off x="0" y="0"/>
+                      <a:ext cx="5400040" cy="2487295"/>
+                    </a:xfrm>
+                    <a:prstGeom prst="rect">
+                      <a:avLst/>
+                    </a:prstGeom>
+                  </pic:spPr>
+                </pic:pic>
+              </a:graphicData>
+            </a:graphic>
+          </wp:inline>
+        </w:drawing>
+      </w:r>
+    </w:p>
+    <w:p>
+      <w:pPr>
+        <w:jc w:val="both"/>
+      </w:pPr>
+    </w:p>
+    <w:p>
+      <w:pPr>
+        <w:jc w:val="both"/>
+      </w:pPr>
+      <w:r>
+        <w:t>A de lançamento que contêm todos os lançamentos uma tabela auxiliar que tem os cadastros de tipos de lançamentos.</w:t>
+      </w:r>
+    </w:p>
+    <w:p>
+      <w:pPr>
+        <w:jc w:val="both"/>
+      </w:pPr>
+      <w:r>
+        <w:t>Infelizmente não tenho nenhuma ferramenta aqui disponível que modele alguns diagramas.</w:t>
+      </w:r>
+    </w:p>
+    <w:p>
+      <w:pPr>
+        <w:jc w:val="both"/>
+      </w:pPr>
+      <w:r>
+        <w:t xml:space="preserve">Em tese a visão global do conceito </w:t>
+      </w:r>
+      <w:proofErr w:type="gramStart"/>
+      <w:r>
+        <w:t>dos lançamento</w:t>
+      </w:r>
+      <w:proofErr w:type="gramEnd"/>
+      <w:r>
+        <w:t xml:space="preserve"> pode ser visualizada no diagrama abaixo:</w:t>
+      </w:r>
+    </w:p>
+    <w:p>
+      <w:pPr>
+        <w:jc w:val="both"/>
+      </w:pPr>
+      <w:r>
+        <w:drawing>
+          <wp:inline distT="0" distB="0" distL="0" distR="0" wp14:anchorId="2519C802" wp14:editId="77F84ECA">
+            <wp:extent cx="5400040" cy="3068320"/>
+            <wp:effectExtent l="0" t="0" r="0" b="0"/>
+            <wp:docPr id="1510722314" name="Imagem 1" descr="Diagrama&#10;&#10;Descrição gerada automaticamente"/>
+            <wp:cNvGraphicFramePr>
+              <a:graphicFrameLocks xmlns:a="http://schemas.openxmlformats.org/drawingml/2006/main" noChangeAspect="1"/>
+            </wp:cNvGraphicFramePr>
+            <a:graphic xmlns:a="http://schemas.openxmlformats.org/drawingml/2006/main">
+              <a:graphicData uri="http://schemas.openxmlformats.org/drawingml/2006/picture">
+                <pic:pic xmlns:pic="http://schemas.openxmlformats.org/drawingml/2006/picture">
+                  <pic:nvPicPr>
+                    <pic:cNvPr id="1510722314" name="Imagem 1" descr="Diagrama&#10;&#10;Descrição gerada automaticamente"/>
+                    <pic:cNvPicPr/>
+                  </pic:nvPicPr>
+                  <pic:blipFill>
+                    <a:blip r:embed="rId13"/>
+                    <a:stretch>
+                      <a:fillRect/>
+                    </a:stretch>
+                  </pic:blipFill>
+                  <pic:spPr>
+                    <a:xfrm>
+                      <a:off x="0" y="0"/>
+                      <a:ext cx="5400040" cy="3068320"/>
+                    </a:xfrm>
+                    <a:prstGeom prst="rect">
+                      <a:avLst/>
+                    </a:prstGeom>
+                  </pic:spPr>
+                </pic:pic>
+              </a:graphicData>
+            </a:graphic>
+          </wp:inline>
+        </w:drawing>
+      </w:r>
+    </w:p>
+    <w:p>
+      <w:pPr>
+        <w:jc w:val="both"/>
+      </w:pPr>
+      <w:r>
+        <w:t>As partes do projeto separadas de acordo com as responsabilidades em si</w:t>
+      </w:r>
+    </w:p>
+    <w:p>
+      <w:pPr>
+        <w:jc w:val="both"/>
+      </w:pPr>
+      <w:r>
+        <w:lastRenderedPageBreak/>
+        <w:drawing>
+          <wp:inline distT="0" distB="0" distL="0" distR="0" wp14:anchorId="6F1B357A" wp14:editId="561A7371">
+            <wp:extent cx="5400040" cy="1952625"/>
+            <wp:effectExtent l="0" t="0" r="0" b="9525"/>
+            <wp:docPr id="1629023837" name="Imagem 1" descr="Texto&#10;&#10;Descrição gerada automaticamente"/>
+            <wp:cNvGraphicFramePr>
+              <a:graphicFrameLocks xmlns:a="http://schemas.openxmlformats.org/drawingml/2006/main" noChangeAspect="1"/>
+            </wp:cNvGraphicFramePr>
+            <a:graphic xmlns:a="http://schemas.openxmlformats.org/drawingml/2006/main">
+              <a:graphicData uri="http://schemas.openxmlformats.org/drawingml/2006/picture">
+                <pic:pic xmlns:pic="http://schemas.openxmlformats.org/drawingml/2006/picture">
+                  <pic:nvPicPr>
+                    <pic:cNvPr id="1629023837" name="Imagem 1" descr="Texto&#10;&#10;Descrição gerada automaticamente"/>
+                    <pic:cNvPicPr/>
+                  </pic:nvPicPr>
+                  <pic:blipFill>
+                    <a:blip r:embed="rId14"/>
+                    <a:stretch>
+                      <a:fillRect/>
+                    </a:stretch>
+                  </pic:blipFill>
+                  <pic:spPr>
+                    <a:xfrm>
+                      <a:off x="0" y="0"/>
+                      <a:ext cx="5400040" cy="1952625"/>
+                    </a:xfrm>
+                    <a:prstGeom prst="rect">
+                      <a:avLst/>
+                    </a:prstGeom>
+                  </pic:spPr>
+                </pic:pic>
+              </a:graphicData>
+            </a:graphic>
+          </wp:inline>
+        </w:drawing>
+      </w:r>
+    </w:p>
+    <w:p>
+      <w:pPr>
+        <w:jc w:val="both"/>
+      </w:pPr>
+    </w:p>
+    <w:p>
+      <w:pPr>
+        <w:jc w:val="both"/>
+      </w:pPr>
+      <w:r>
+        <w:t>Observações:</w:t>
+      </w:r>
+    </w:p>
+    <w:p>
+      <w:pPr>
+        <w:jc w:val="both"/>
+      </w:pPr>
+      <w:r>
+        <w:t>O serviço de API só efetua a chamada, e alguma conversão de entrada de string para data, e retorna como “Completo” com o conteúdo ou não de acordo com o resultado do método do serviço.</w:t>
+      </w:r>
+    </w:p>
+    <w:p>
+      <w:pPr>
+        <w:jc w:val="both"/>
+      </w:pPr>
+      <w:r>
+        <w:t xml:space="preserve">O domínio é toda a regra, soma, tudo que se diz ao negócio. Tem a configuração das entidades de domínio e os comportamentos </w:t>
+      </w:r>
+      <w:proofErr w:type="gramStart"/>
+      <w:r>
+        <w:t>dos mesmos</w:t>
+      </w:r>
+      <w:proofErr w:type="gramEnd"/>
+      <w:r>
+        <w:t>.</w:t>
+      </w:r>
     </w:p>
     <w:sectPr>
       <w:pgSz w:w="11906" w:h="16838"/>
@@ -3078,6 +3327,7 @@
   <w:style w:type="character" w:default="1" w:styleId="Fontepargpadro">
     <w:name w:val="Default Paragraph Font"/>
     <w:uiPriority w:val="1"/>
+    <w:semiHidden/>
     <w:unhideWhenUsed/>
   </w:style>
   <w:style w:type="table" w:default="1" w:styleId="Tabelanormal">

</xml_diff>